<commit_message>
Correct benchmark arithmetic, chronology, and legal guide
</commit_message>
<xml_diff>
--- a/instructor/instructor_benchmark_guide.docx
+++ b/instructor/instructor_benchmark_guide.docx
@@ -269,14 +269,9 @@
     <w:p>
       <w:pPr>
         <w:pStyle w:val="ListBullet"/>
-        <w:spacing w:after="80"/>
       </w:pPr>
       <w:r>
-        <w:rPr>
-          <w:rFonts w:ascii="Calibri" w:hAnsi="Calibri"/>
-          <w:sz w:val="22"/>
-        </w:rPr>
-        <w:t>The bridge had a real commercial rationale: on 9 September unrestricted cash was INR 13.4m and payroll/statutory outflow due by month-end was INR 18.9m. A funding solution was required.</w:t>
+        <w:t>Bridge ground truth: INR 90m for 5.0m shares means INR 18.00 per share. Meridian signed a specific 30 September waiver of any clause 7 adjustment for this bridge; the signatory-authority schedule is not in the participant file.</w:t>
       </w:r>
     </w:p>
     <w:p>
@@ -289,7 +284,20 @@
           <w:rFonts w:ascii="Calibri" w:hAnsi="Calibri"/>
           <w:sz w:val="22"/>
         </w:rPr>
-        <w:t>No compliant 15-Business-Day pro rata offer was made. Nisha never waived pre-emption. Aarav proposed conditional funding at INR 6.00, not a committed September rescue on bridge terms.</w:t>
+        <w:t>The bridge had a real commercial rationale: the condensed bank statement reconciles to INR 13.4m unrestricted cash on 9 September after an INR 12.2m aggregate ordinary-operating debit. Payroll of INR 12.7m was paid on 30 September; a further INR 6.2m of statutory/other outflows remained due or rolled. A funding solution was required, although the size, price and allocation remain contestable.</w:t>
+      </w:r>
+    </w:p>
+    <w:p>
+      <w:pPr>
+        <w:pStyle w:val="ListBullet"/>
+        <w:spacing w:after="80"/>
+      </w:pPr>
+      <w:r>
+        <w:rPr>
+          <w:rFonts w:ascii="Calibri" w:hAnsi="Calibri"/>
+          <w:sz w:val="22"/>
+        </w:rPr>
+        <w:t>No compliant 15-Business-Day pro rata offer was made. Nisha never waived pre-emption. Aarav proposed conditional funding at INR 60.00, not a committed September rescue on the INR 18.00 bridge terms.</w:t>
       </w:r>
     </w:p>
     <w:p>
@@ -1318,16 +1326,8 @@
             <w:vAlign w:val="top"/>
           </w:tcPr>
           <w:p>
-            <w:pPr>
-              <w:spacing w:after="40"/>
-            </w:pPr>
             <w:r>
-              <w:rPr>
-                <w:rFonts w:ascii="Calibri" w:hAnsi="Calibri"/>
-                <w:b w:val="0"/>
-                <w:sz w:val="16"/>
-              </w:rPr>
-              <w:t>EGM votes before Aarav joins; resolutions declared passed.</w:t>
+              <w:t>EGM votes before Aarav joins; resolutions declared passed. Meridian signs a specific written waiver of clause 7 anti-dilution adjustment for this bridge.</w:t>
             </w:r>
           </w:p>
         </w:tc>
@@ -1370,16 +1370,8 @@
             <w:vAlign w:val="top"/>
           </w:tcPr>
           <w:p>
-            <w:pPr>
-              <w:spacing w:after="40"/>
-            </w:pPr>
             <w:r>
-              <w:rPr>
-                <w:rFonts w:ascii="Calibri" w:hAnsi="Calibri"/>
-                <w:b w:val="0"/>
-                <w:sz w:val="16"/>
-              </w:rPr>
-              <w:t>Board allots shares, terminates Aarav and issues bad-leaver call.</w:t>
+              <w:t>Board allots 5,000,000 shares at INR 18.00 each, terminates Aarav and issues bad-leaver call.</w:t>
             </w:r>
           </w:p>
         </w:tc>
@@ -1501,16 +1493,8 @@
             <w:vAlign w:val="top"/>
           </w:tcPr>
           <w:p>
-            <w:pPr>
-              <w:spacing w:after="40"/>
-            </w:pPr>
             <w:r>
-              <w:rPr>
-                <w:rFonts w:ascii="Calibri" w:hAnsi="Calibri"/>
-                <w:b w:val="0"/>
-                <w:sz w:val="16"/>
-              </w:rPr>
-              <w:t>2025-10-06/13</w:t>
+              <w:t>2025-10-06/13/15</w:t>
             </w:r>
           </w:p>
         </w:tc>
@@ -1526,16 +1510,8 @@
             <w:vAlign w:val="top"/>
           </w:tcPr>
           <w:p>
-            <w:pPr>
-              <w:spacing w:after="40"/>
-            </w:pPr>
             <w:r>
-              <w:rPr>
-                <w:rFonts w:ascii="Calibri" w:hAnsi="Calibri"/>
-                <w:b w:val="0"/>
-                <w:sz w:val="16"/>
-              </w:rPr>
-              <w:t>Notice and reply.</w:t>
+              <w:t>Notice and reply; EGM minutes signed/created on 15 October.</w:t>
             </w:r>
           </w:p>
         </w:tc>
@@ -4178,6 +4154,776 @@
           </w:p>
         </w:tc>
       </w:tr>
+      <w:tr>
+        <w:tc>
+          <w:tcPr>
+            <w:tcW w:type="dxa" w:w="792"/>
+            <w:tcMar>
+              <w:top w:w="80" w:type="dxa"/>
+              <w:start w:w="120" w:type="dxa"/>
+              <w:bottom w:w="80" w:type="dxa"/>
+              <w:end w:w="120" w:type="dxa"/>
+            </w:tcMar>
+            <w:vAlign w:val="top"/>
+          </w:tcPr>
+          <w:p>
+            <w:r>
+              <w:t>I-25</w:t>
+            </w:r>
+          </w:p>
+        </w:tc>
+        <w:tc>
+          <w:tcPr>
+            <w:tcW w:type="dxa" w:w="1800"/>
+            <w:tcMar>
+              <w:top w:w="80" w:type="dxa"/>
+              <w:start w:w="120" w:type="dxa"/>
+              <w:bottom w:w="80" w:type="dxa"/>
+              <w:end w:w="120" w:type="dxa"/>
+            </w:tcMar>
+            <w:vAlign w:val="top"/>
+          </w:tcPr>
+          <w:p>
+            <w:r>
+              <w:t>Bridge issue price</w:t>
+            </w:r>
+          </w:p>
+        </w:tc>
+        <w:tc>
+          <w:tcPr>
+            <w:tcW w:type="dxa" w:w="2448"/>
+            <w:tcMar>
+              <w:top w:w="80" w:type="dxa"/>
+              <w:start w:w="120" w:type="dxa"/>
+              <w:bottom w:w="80" w:type="dxa"/>
+              <w:end w:w="120" w:type="dxa"/>
+            </w:tcMar>
+            <w:vAlign w:val="top"/>
+          </w:tcPr>
+          <w:p>
+            <w:r>
+              <w:t>VP-05/06/11/12/17/18</w:t>
+            </w:r>
+          </w:p>
+        </w:tc>
+        <w:tc>
+          <w:tcPr>
+            <w:tcW w:type="dxa" w:w="4320"/>
+            <w:tcMar>
+              <w:top w:w="80" w:type="dxa"/>
+              <w:start w:w="120" w:type="dxa"/>
+              <w:bottom w:w="80" w:type="dxa"/>
+              <w:end w:w="120" w:type="dxa"/>
+            </w:tcMar>
+            <w:vAlign w:val="top"/>
+          </w:tcPr>
+          <w:p>
+            <w:r>
+              <w:t>INR 90m divided by 5m shares is INR 18.00. Any INR 1.80 analysis is a material arithmetic error.</w:t>
+            </w:r>
+          </w:p>
+        </w:tc>
+      </w:tr>
+      <w:tr>
+        <w:tc>
+          <w:tcPr>
+            <w:tcW w:type="dxa" w:w="792"/>
+            <w:tcMar>
+              <w:top w:w="80" w:type="dxa"/>
+              <w:start w:w="120" w:type="dxa"/>
+              <w:bottom w:w="80" w:type="dxa"/>
+              <w:end w:w="120" w:type="dxa"/>
+            </w:tcMar>
+            <w:vAlign w:val="top"/>
+          </w:tcPr>
+          <w:p>
+            <w:r>
+              <w:t>I-26</w:t>
+            </w:r>
+          </w:p>
+        </w:tc>
+        <w:tc>
+          <w:tcPr>
+            <w:tcW w:type="dxa" w:w="1800"/>
+            <w:tcMar>
+              <w:top w:w="80" w:type="dxa"/>
+              <w:start w:w="120" w:type="dxa"/>
+              <w:bottom w:w="80" w:type="dxa"/>
+              <w:end w:w="120" w:type="dxa"/>
+            </w:tcMar>
+            <w:vAlign w:val="top"/>
+          </w:tcPr>
+          <w:p>
+            <w:r>
+              <w:t>Anti-dilution waiver</w:t>
+            </w:r>
+          </w:p>
+        </w:tc>
+        <w:tc>
+          <w:tcPr>
+            <w:tcW w:type="dxa" w:w="2448"/>
+            <w:tcMar>
+              <w:top w:w="80" w:type="dxa"/>
+              <w:start w:w="120" w:type="dxa"/>
+              <w:bottom w:w="80" w:type="dxa"/>
+              <w:end w:w="120" w:type="dxa"/>
+            </w:tcMar>
+            <w:vAlign w:val="top"/>
+          </w:tcPr>
+          <w:p>
+            <w:r>
+              <w:t>VP-01 cl 7/16; VP-05 D; VP-17</w:t>
+            </w:r>
+          </w:p>
+        </w:tc>
+        <w:tc>
+          <w:tcPr>
+            <w:tcW w:type="dxa" w:w="4320"/>
+            <w:tcMar>
+              <w:top w:w="80" w:type="dxa"/>
+              <w:start w:w="120" w:type="dxa"/>
+              <w:bottom w:w="80" w:type="dxa"/>
+              <w:end w:w="120" w:type="dxa"/>
+            </w:tcMar>
+            <w:vAlign w:val="top"/>
+          </w:tcPr>
+          <w:p>
+            <w:r>
+              <w:t>On the executed SHA wording, INR 18 is not below the stated INR 6 conversion price. If the INR 6 drafting error is rectified to the commercial INR 60 price, the bridge would engage clause 7 absent waiver. Meridian specifically waived any adjustment in writing for this bridge, so no adjustment is modelled under either pathway. The missing delegated-authority schedule remains an authentication/authority point.</w:t>
+            </w:r>
+          </w:p>
+        </w:tc>
+      </w:tr>
+      <w:tr>
+        <w:tc>
+          <w:tcPr>
+            <w:tcW w:type="dxa" w:w="792"/>
+            <w:tcMar>
+              <w:top w:w="80" w:type="dxa"/>
+              <w:start w:w="120" w:type="dxa"/>
+              <w:bottom w:w="80" w:type="dxa"/>
+              <w:end w:w="120" w:type="dxa"/>
+            </w:tcMar>
+            <w:vAlign w:val="top"/>
+          </w:tcPr>
+          <w:p>
+            <w:r>
+              <w:t>I-27</w:t>
+            </w:r>
+          </w:p>
+        </w:tc>
+        <w:tc>
+          <w:tcPr>
+            <w:tcW w:type="dxa" w:w="1800"/>
+            <w:tcMar>
+              <w:top w:w="80" w:type="dxa"/>
+              <w:start w:w="120" w:type="dxa"/>
+              <w:bottom w:w="80" w:type="dxa"/>
+              <w:end w:w="120" w:type="dxa"/>
+            </w:tcMar>
+            <w:vAlign w:val="top"/>
+          </w:tcPr>
+          <w:p>
+            <w:r>
+              <w:t>Board notice periods</w:t>
+            </w:r>
+          </w:p>
+        </w:tc>
+        <w:tc>
+          <w:tcPr>
+            <w:tcW w:type="dxa" w:w="2448"/>
+            <w:tcMar>
+              <w:top w:w="80" w:type="dxa"/>
+              <w:start w:w="120" w:type="dxa"/>
+              <w:bottom w:w="80" w:type="dxa"/>
+              <w:end w:w="120" w:type="dxa"/>
+            </w:tcMar>
+            <w:vAlign w:val="top"/>
+          </w:tcPr>
+          <w:p>
+            <w:r>
+              <w:t>VP-01 cl 3.3; VP-05 B-D</w:t>
+            </w:r>
+          </w:p>
+        </w:tc>
+        <w:tc>
+          <w:tcPr>
+            <w:tcW w:type="dxa" w:w="4320"/>
+            <w:tcMar>
+              <w:top w:w="80" w:type="dxa"/>
+              <w:start w:w="120" w:type="dxa"/>
+              <w:bottom w:w="80" w:type="dxa"/>
+              <w:end w:w="120" w:type="dxa"/>
+            </w:tcMar>
+            <w:vAlign w:val="top"/>
+          </w:tcPr>
+          <w:p>
+            <w:r>
+              <w:t>28 Aug had six calendar days; 12 Sep had about 35h48m; 1 Oct had about 15h50m. SHA requires 48 hours only for an emergency meeting and bars financing-only use. Companies Act s173(3) instead permits shorter notice for urgent business subject to the independent-director safeguard; Rohan attended.</w:t>
+            </w:r>
+          </w:p>
+        </w:tc>
+      </w:tr>
+      <w:tr>
+        <w:tc>
+          <w:tcPr>
+            <w:tcW w:type="dxa" w:w="792"/>
+            <w:tcMar>
+              <w:top w:w="80" w:type="dxa"/>
+              <w:start w:w="120" w:type="dxa"/>
+              <w:bottom w:w="80" w:type="dxa"/>
+              <w:end w:w="120" w:type="dxa"/>
+            </w:tcMar>
+            <w:vAlign w:val="top"/>
+          </w:tcPr>
+          <w:p>
+            <w:r>
+              <w:t>I-28</w:t>
+            </w:r>
+          </w:p>
+        </w:tc>
+        <w:tc>
+          <w:tcPr>
+            <w:tcW w:type="dxa" w:w="1800"/>
+            <w:tcMar>
+              <w:top w:w="80" w:type="dxa"/>
+              <w:start w:w="120" w:type="dxa"/>
+              <w:bottom w:w="80" w:type="dxa"/>
+              <w:end w:w="120" w:type="dxa"/>
+            </w:tcMar>
+            <w:vAlign w:val="top"/>
+          </w:tcPr>
+          <w:p>
+            <w:r>
+              <w:t>Access before authority</w:t>
+            </w:r>
+          </w:p>
+        </w:tc>
+        <w:tc>
+          <w:tcPr>
+            <w:tcW w:type="dxa" w:w="2448"/>
+            <w:tcMar>
+              <w:top w:w="80" w:type="dxa"/>
+              <w:start w:w="120" w:type="dxa"/>
+              <w:bottom w:w="80" w:type="dxa"/>
+              <w:end w:w="120" w:type="dxa"/>
+            </w:tcMar>
+            <w:vAlign w:val="top"/>
+          </w:tcPr>
+          <w:p>
+            <w:r>
+              <w:t>VP-05 C; VP-07; VP-15</w:t>
+            </w:r>
+          </w:p>
+        </w:tc>
+        <w:tc>
+          <w:tcPr>
+            <w:tcW w:type="dxa" w:w="4320"/>
+            <w:tcMar>
+              <w:top w:w="80" w:type="dxa"/>
+              <w:start w:w="120" w:type="dxa"/>
+              <w:bottom w:w="80" w:type="dxa"/>
+              <w:end w:w="120" w:type="dxa"/>
+            </w:tcMar>
+            <w:vAlign w:val="top"/>
+          </w:tcPr>
+          <w:p>
+            <w:r>
+              <w:t>Aarav account/access was disabled by 10 Sep, before the 12 Sep Board resolution. This affects employment process, preservation and whether service to the account was effective; identify who ordered the earlier action.</w:t>
+            </w:r>
+          </w:p>
+        </w:tc>
+      </w:tr>
+      <w:tr>
+        <w:tc>
+          <w:tcPr>
+            <w:tcW w:type="dxa" w:w="792"/>
+            <w:tcMar>
+              <w:top w:w="80" w:type="dxa"/>
+              <w:start w:w="120" w:type="dxa"/>
+              <w:bottom w:w="80" w:type="dxa"/>
+              <w:end w:w="120" w:type="dxa"/>
+            </w:tcMar>
+            <w:vAlign w:val="top"/>
+          </w:tcPr>
+          <w:p>
+            <w:r>
+              <w:t>I-29</w:t>
+            </w:r>
+          </w:p>
+        </w:tc>
+        <w:tc>
+          <w:tcPr>
+            <w:tcW w:type="dxa" w:w="1800"/>
+            <w:tcMar>
+              <w:top w:w="80" w:type="dxa"/>
+              <w:start w:w="120" w:type="dxa"/>
+              <w:bottom w:w="80" w:type="dxa"/>
+              <w:end w:w="120" w:type="dxa"/>
+            </w:tcMar>
+            <w:vAlign w:val="top"/>
+          </w:tcPr>
+          <w:p>
+            <w:r>
+              <w:t>Preference voting rights</w:t>
+            </w:r>
+          </w:p>
+        </w:tc>
+        <w:tc>
+          <w:tcPr>
+            <w:tcW w:type="dxa" w:w="2448"/>
+            <w:tcMar>
+              <w:top w:w="80" w:type="dxa"/>
+              <w:start w:w="120" w:type="dxa"/>
+              <w:bottom w:w="80" w:type="dxa"/>
+              <w:end w:w="120" w:type="dxa"/>
+            </w:tcMar>
+            <w:vAlign w:val="top"/>
+          </w:tcPr>
+          <w:p>
+            <w:r>
+              <w:t>VP-01/02/06</w:t>
+            </w:r>
+          </w:p>
+        </w:tc>
+        <w:tc>
+          <w:tcPr>
+            <w:tcW w:type="dxa" w:w="4320"/>
+            <w:tcMar>
+              <w:top w:w="80" w:type="dxa"/>
+              <w:start w:w="120" w:type="dxa"/>
+              <w:bottom w:w="80" w:type="dxa"/>
+              <w:end w:w="120" w:type="dxa"/>
+            </w:tcMar>
+            <w:vAlign w:val="top"/>
+          </w:tcPr>
+          <w:p>
+            <w:r>
+              <w:t>Meridian voted its CCPS on an as-converted basis. Section 47(2) is relevant, but private companies may disapply ss43/47 if their memorandum or articles so provide. Only extracts are supplied, so validity is deliberately unresolved.</w:t>
+            </w:r>
+          </w:p>
+        </w:tc>
+      </w:tr>
+      <w:tr>
+        <w:tc>
+          <w:tcPr>
+            <w:tcW w:type="dxa" w:w="792"/>
+            <w:tcMar>
+              <w:top w:w="80" w:type="dxa"/>
+              <w:start w:w="120" w:type="dxa"/>
+              <w:bottom w:w="80" w:type="dxa"/>
+              <w:end w:w="120" w:type="dxa"/>
+            </w:tcMar>
+            <w:vAlign w:val="top"/>
+          </w:tcPr>
+          <w:p>
+            <w:r>
+              <w:t>I-30</w:t>
+            </w:r>
+          </w:p>
+        </w:tc>
+        <w:tc>
+          <w:tcPr>
+            <w:tcW w:type="dxa" w:w="1800"/>
+            <w:tcMar>
+              <w:top w:w="80" w:type="dxa"/>
+              <w:start w:w="120" w:type="dxa"/>
+              <w:bottom w:w="80" w:type="dxa"/>
+              <w:end w:w="120" w:type="dxa"/>
+            </w:tcMar>
+            <w:vAlign w:val="top"/>
+          </w:tcPr>
+          <w:p>
+            <w:r>
+              <w:t>Private placement record</w:t>
+            </w:r>
+          </w:p>
+        </w:tc>
+        <w:tc>
+          <w:tcPr>
+            <w:tcW w:type="dxa" w:w="2448"/>
+            <w:tcMar>
+              <w:top w:w="80" w:type="dxa"/>
+              <w:start w:w="120" w:type="dxa"/>
+              <w:bottom w:w="80" w:type="dxa"/>
+              <w:end w:w="120" w:type="dxa"/>
+            </w:tcMar>
+            <w:vAlign w:val="top"/>
+          </w:tcPr>
+          <w:p>
+            <w:r>
+              <w:t>VP-05/06/12-14/17/18</w:t>
+            </w:r>
+          </w:p>
+        </w:tc>
+        <w:tc>
+          <w:tcPr>
+            <w:tcW w:type="dxa" w:w="4320"/>
+            <w:tcMar>
+              <w:top w:w="80" w:type="dxa"/>
+              <w:start w:w="120" w:type="dxa"/>
+              <w:bottom w:w="80" w:type="dxa"/>
+              <w:end w:w="120" w:type="dxa"/>
+            </w:tcMar>
+            <w:vAlign w:val="top"/>
+          </w:tcPr>
+          <w:p>
+            <w:r>
+              <w:t>Test Companies Act ss42 and 62(1)(c), Share Capital Rules r13, Prospectus and Allotment Rules r14, valuation, identified offerees, PAS-4/PAS-5/PAS-3 and receipt/use of money. The file omits material records and shows a Riverstone shortfall; do not assume every defect has an identical remedy.</w:t>
+            </w:r>
+          </w:p>
+        </w:tc>
+      </w:tr>
+      <w:tr>
+        <w:tc>
+          <w:tcPr>
+            <w:tcW w:type="dxa" w:w="792"/>
+            <w:tcMar>
+              <w:top w:w="80" w:type="dxa"/>
+              <w:start w:w="120" w:type="dxa"/>
+              <w:bottom w:w="80" w:type="dxa"/>
+              <w:end w:w="120" w:type="dxa"/>
+            </w:tcMar>
+            <w:vAlign w:val="top"/>
+          </w:tcPr>
+          <w:p>
+            <w:r>
+              <w:t>I-31</w:t>
+            </w:r>
+          </w:p>
+        </w:tc>
+        <w:tc>
+          <w:tcPr>
+            <w:tcW w:type="dxa" w:w="1800"/>
+            <w:tcMar>
+              <w:top w:w="80" w:type="dxa"/>
+              <w:start w:w="120" w:type="dxa"/>
+              <w:bottom w:w="80" w:type="dxa"/>
+              <w:end w:w="120" w:type="dxa"/>
+            </w:tcMar>
+            <w:vAlign w:val="top"/>
+          </w:tcPr>
+          <w:p>
+            <w:r>
+              <w:t>Face value and standing</w:t>
+            </w:r>
+          </w:p>
+        </w:tc>
+        <w:tc>
+          <w:tcPr>
+            <w:tcW w:type="dxa" w:w="2448"/>
+            <w:tcMar>
+              <w:top w:w="80" w:type="dxa"/>
+              <w:start w:w="120" w:type="dxa"/>
+              <w:bottom w:w="80" w:type="dxa"/>
+              <w:end w:w="120" w:type="dxa"/>
+            </w:tcMar>
+            <w:vAlign w:val="top"/>
+          </w:tcPr>
+          <w:p>
+            <w:r>
+              <w:t>VP-01/13/17</w:t>
+            </w:r>
+          </w:p>
+        </w:tc>
+        <w:tc>
+          <w:tcPr>
+            <w:tcW w:type="dxa" w:w="4320"/>
+            <w:tcMar>
+              <w:top w:w="80" w:type="dxa"/>
+              <w:start w:w="120" w:type="dxa"/>
+              <w:bottom w:w="80" w:type="dxa"/>
+              <w:end w:w="120" w:type="dxa"/>
+            </w:tcMar>
+            <w:vAlign w:val="top"/>
+          </w:tcPr>
+          <w:p>
+            <w:r>
+              <w:t>Face value is omitted, weakening a definitive s53 discount analysis and capital-based s244 calculation. Aarav nevertheless appears to satisfy s244 through the alternative member-count limb (one of six members) and exceeds 10% on share-count/value assumptions used in the record.</w:t>
+            </w:r>
+          </w:p>
+        </w:tc>
+      </w:tr>
+      <w:tr>
+        <w:tc>
+          <w:tcPr>
+            <w:tcW w:type="dxa" w:w="792"/>
+            <w:tcMar>
+              <w:top w:w="80" w:type="dxa"/>
+              <w:start w:w="120" w:type="dxa"/>
+              <w:bottom w:w="80" w:type="dxa"/>
+              <w:end w:w="120" w:type="dxa"/>
+            </w:tcMar>
+            <w:vAlign w:val="top"/>
+          </w:tcPr>
+          <w:p>
+            <w:r>
+              <w:t>I-32</w:t>
+            </w:r>
+          </w:p>
+        </w:tc>
+        <w:tc>
+          <w:tcPr>
+            <w:tcW w:type="dxa" w:w="1800"/>
+            <w:tcMar>
+              <w:top w:w="80" w:type="dxa"/>
+              <w:start w:w="120" w:type="dxa"/>
+              <w:bottom w:w="80" w:type="dxa"/>
+              <w:end w:w="120" w:type="dxa"/>
+            </w:tcMar>
+            <w:vAlign w:val="top"/>
+          </w:tcPr>
+          <w:p>
+            <w:r>
+              <w:t>Leena board status</w:t>
+            </w:r>
+          </w:p>
+        </w:tc>
+        <w:tc>
+          <w:tcPr>
+            <w:tcW w:type="dxa" w:w="2448"/>
+            <w:tcMar>
+              <w:top w:w="80" w:type="dxa"/>
+              <w:start w:w="120" w:type="dxa"/>
+              <w:bottom w:w="80" w:type="dxa"/>
+              <w:end w:w="120" w:type="dxa"/>
+            </w:tcMar>
+            <w:vAlign w:val="top"/>
+          </w:tcPr>
+          <w:p>
+            <w:r>
+              <w:t>VP-06; VP-05 D</w:t>
+            </w:r>
+          </w:p>
+        </w:tc>
+        <w:tc>
+          <w:tcPr>
+            <w:tcW w:type="dxa" w:w="4320"/>
+            <w:tcMar>
+              <w:top w:w="80" w:type="dxa"/>
+              <w:start w:w="120" w:type="dxa"/>
+              <w:bottom w:w="80" w:type="dxa"/>
+              <w:end w:w="120" w:type="dxa"/>
+            </w:tcMar>
+            <w:vAlign w:val="top"/>
+          </w:tcPr>
+          <w:p>
+            <w:r>
+              <w:t>EGM minutes appoint Leena director, but 1 Oct Board minutes list only three directors and do not invite or record Leena. Determine effective appointment, DIR-12 timing, notice and quorum implications.</w:t>
+            </w:r>
+          </w:p>
+        </w:tc>
+      </w:tr>
+      <w:tr>
+        <w:tc>
+          <w:tcPr>
+            <w:tcW w:type="dxa" w:w="792"/>
+            <w:tcMar>
+              <w:top w:w="80" w:type="dxa"/>
+              <w:start w:w="120" w:type="dxa"/>
+              <w:bottom w:w="80" w:type="dxa"/>
+              <w:end w:w="120" w:type="dxa"/>
+            </w:tcMar>
+            <w:vAlign w:val="top"/>
+          </w:tcPr>
+          <w:p>
+            <w:r>
+              <w:t>I-33</w:t>
+            </w:r>
+          </w:p>
+        </w:tc>
+        <w:tc>
+          <w:tcPr>
+            <w:tcW w:type="dxa" w:w="1800"/>
+            <w:tcMar>
+              <w:top w:w="80" w:type="dxa"/>
+              <w:start w:w="120" w:type="dxa"/>
+              <w:bottom w:w="80" w:type="dxa"/>
+              <w:end w:w="120" w:type="dxa"/>
+            </w:tcMar>
+            <w:vAlign w:val="top"/>
+          </w:tcPr>
+          <w:p>
+            <w:r>
+              <w:t>Saffron proxy</w:t>
+            </w:r>
+          </w:p>
+        </w:tc>
+        <w:tc>
+          <w:tcPr>
+            <w:tcW w:type="dxa" w:w="2448"/>
+            <w:tcMar>
+              <w:top w:w="80" w:type="dxa"/>
+              <w:start w:w="120" w:type="dxa"/>
+              <w:bottom w:w="80" w:type="dxa"/>
+              <w:end w:w="120" w:type="dxa"/>
+            </w:tcMar>
+            <w:vAlign w:val="top"/>
+          </w:tcPr>
+          <w:p>
+            <w:r>
+              <w:t>VP-06; Companies Act ss105/113</w:t>
+            </w:r>
+          </w:p>
+        </w:tc>
+        <w:tc>
+          <w:tcPr>
+            <w:tcW w:type="dxa" w:w="4320"/>
+            <w:tcMar>
+              <w:top w:w="80" w:type="dxa"/>
+              <w:start w:w="120" w:type="dxa"/>
+              <w:bottom w:w="80" w:type="dxa"/>
+              <w:end w:w="120" w:type="dxa"/>
+            </w:tcMar>
+            <w:vAlign w:val="top"/>
+          </w:tcPr>
+          <w:p>
+            <w:r>
+              <w:t>Late deposit is a live issue. A body corporate is not barred per se from appointing a proxy: s105(6)(b) contemplates execution by an authorised officer/attorney; s113 is an alternative representation route.</w:t>
+            </w:r>
+          </w:p>
+        </w:tc>
+      </w:tr>
+      <w:tr>
+        <w:tc>
+          <w:tcPr>
+            <w:tcW w:type="dxa" w:w="792"/>
+            <w:tcMar>
+              <w:top w:w="80" w:type="dxa"/>
+              <w:start w:w="120" w:type="dxa"/>
+              <w:bottom w:w="80" w:type="dxa"/>
+              <w:end w:w="120" w:type="dxa"/>
+            </w:tcMar>
+            <w:vAlign w:val="top"/>
+          </w:tcPr>
+          <w:p>
+            <w:r>
+              <w:t>I-34</w:t>
+            </w:r>
+          </w:p>
+        </w:tc>
+        <w:tc>
+          <w:tcPr>
+            <w:tcW w:type="dxa" w:w="1800"/>
+            <w:tcMar>
+              <w:top w:w="80" w:type="dxa"/>
+              <w:start w:w="120" w:type="dxa"/>
+              <w:bottom w:w="80" w:type="dxa"/>
+              <w:end w:w="120" w:type="dxa"/>
+            </w:tcMar>
+            <w:vAlign w:val="top"/>
+          </w:tcPr>
+          <w:p>
+            <w:r>
+              <w:t>Report and bank chronology</w:t>
+            </w:r>
+          </w:p>
+        </w:tc>
+        <w:tc>
+          <w:tcPr>
+            <w:tcW w:type="dxa" w:w="2448"/>
+            <w:tcMar>
+              <w:top w:w="80" w:type="dxa"/>
+              <w:start w:w="120" w:type="dxa"/>
+              <w:bottom w:w="80" w:type="dxa"/>
+              <w:end w:w="120" w:type="dxa"/>
+            </w:tcMar>
+            <w:vAlign w:val="top"/>
+          </w:tcPr>
+          <w:p>
+            <w:r>
+              <w:t>VP-10/15/18</w:t>
+            </w:r>
+          </w:p>
+        </w:tc>
+        <w:tc>
+          <w:tcPr>
+            <w:tcW w:type="dxa" w:w="4320"/>
+            <w:tcMar>
+              <w:top w:w="80" w:type="dxa"/>
+              <w:start w:w="120" w:type="dxa"/>
+              <w:bottom w:w="80" w:type="dxa"/>
+              <w:end w:w="120" w:type="dxa"/>
+            </w:tcMar>
+            <w:vAlign w:val="top"/>
+          </w:tcPr>
+          <w:p>
+            <w:r>
+              <w:t>The 10 Sep report cannot narrate the 18 Sep refund; corrected report records only the INR 4.3m gap at report date. The later bank record shows the INR 3.2m refund. Bank CSV export is 11 Oct, after statement end 10 Oct.</w:t>
+            </w:r>
+          </w:p>
+        </w:tc>
+      </w:tr>
+      <w:tr>
+        <w:tc>
+          <w:tcPr>
+            <w:tcW w:type="dxa" w:w="792"/>
+            <w:tcMar>
+              <w:top w:w="80" w:type="dxa"/>
+              <w:start w:w="120" w:type="dxa"/>
+              <w:bottom w:w="80" w:type="dxa"/>
+              <w:end w:w="120" w:type="dxa"/>
+            </w:tcMar>
+            <w:vAlign w:val="top"/>
+          </w:tcPr>
+          <w:p>
+            <w:r>
+              <w:t>I-35</w:t>
+            </w:r>
+          </w:p>
+        </w:tc>
+        <w:tc>
+          <w:tcPr>
+            <w:tcW w:type="dxa" w:w="1800"/>
+            <w:tcMar>
+              <w:top w:w="80" w:type="dxa"/>
+              <w:start w:w="120" w:type="dxa"/>
+              <w:bottom w:w="80" w:type="dxa"/>
+              <w:end w:w="120" w:type="dxa"/>
+            </w:tcMar>
+            <w:vAlign w:val="top"/>
+          </w:tcPr>
+          <w:p>
+            <w:r>
+              <w:t>Vertex Labs period label</w:t>
+            </w:r>
+          </w:p>
+        </w:tc>
+        <w:tc>
+          <w:tcPr>
+            <w:tcW w:type="dxa" w:w="2448"/>
+            <w:tcMar>
+              <w:top w:w="80" w:type="dxa"/>
+              <w:start w:w="120" w:type="dxa"/>
+              <w:bottom w:w="80" w:type="dxa"/>
+              <w:end w:w="120" w:type="dxa"/>
+            </w:tcMar>
+            <w:vAlign w:val="top"/>
+          </w:tcPr>
+          <w:p>
+            <w:r>
+              <w:t>VP-05 B; VP-10</w:t>
+            </w:r>
+          </w:p>
+        </w:tc>
+        <w:tc>
+          <w:tcPr>
+            <w:tcW w:type="dxa" w:w="4320"/>
+            <w:tcMar>
+              <w:top w:w="80" w:type="dxa"/>
+              <w:start w:w="120" w:type="dxa"/>
+              <w:bottom w:w="80" w:type="dxa"/>
+              <w:end w:w="120" w:type="dxa"/>
+            </w:tcMar>
+            <w:vAlign w:val="top"/>
+          </w:tcPr>
+          <w:p>
+            <w:r>
+              <w:t>The INR 9.6m figure spans 18 Jul, 22 Jul and 2 Aug. Treating it as purely August actual is a presentation/classification issue, not a new payment.</w:t>
+            </w:r>
+          </w:p>
+        </w:tc>
+      </w:tr>
     </w:tbl>
     <w:p>
       <w:pPr>
@@ -4834,6 +5580,150 @@
           </w:p>
         </w:tc>
       </w:tr>
+      <w:tr>
+        <w:tc>
+          <w:tcPr>
+            <w:tcW w:type="dxa" w:w="2376"/>
+            <w:tcMar>
+              <w:top w:w="80" w:type="dxa"/>
+              <w:start w:w="120" w:type="dxa"/>
+              <w:bottom w:w="80" w:type="dxa"/>
+              <w:end w:w="120" w:type="dxa"/>
+            </w:tcMar>
+            <w:vAlign w:val="top"/>
+          </w:tcPr>
+          <w:p>
+            <w:r>
+              <w:t>Preferential/private placement</w:t>
+            </w:r>
+          </w:p>
+        </w:tc>
+        <w:tc>
+          <w:tcPr>
+            <w:tcW w:type="dxa" w:w="6984"/>
+            <w:tcMar>
+              <w:top w:w="80" w:type="dxa"/>
+              <w:start w:w="120" w:type="dxa"/>
+              <w:bottom w:w="80" w:type="dxa"/>
+              <w:end w:w="120" w:type="dxa"/>
+            </w:tcMar>
+            <w:vAlign w:val="top"/>
+          </w:tcPr>
+          <w:p>
+            <w:r>
+              <w:t>Companies Act 2013 ss42 and 62(1)(c); Companies (Share Capital and Debentures) Rules 2014 r13; Companies (Prospectus and Allotment of Securities) Rules 2014 r14 and prescribed PAS records. Test special resolution, identified offerees, registered-valuer pricing, offer/record/return documents, banking trail and full consideration separately.</w:t>
+            </w:r>
+          </w:p>
+        </w:tc>
+      </w:tr>
+      <w:tr>
+        <w:tc>
+          <w:tcPr>
+            <w:tcW w:type="dxa" w:w="2376"/>
+            <w:tcMar>
+              <w:top w:w="80" w:type="dxa"/>
+              <w:start w:w="120" w:type="dxa"/>
+              <w:bottom w:w="80" w:type="dxa"/>
+              <w:end w:w="120" w:type="dxa"/>
+            </w:tcMar>
+            <w:vAlign w:val="top"/>
+          </w:tcPr>
+          <w:p>
+            <w:r>
+              <w:t>Preference voting / private-company exemption</w:t>
+            </w:r>
+          </w:p>
+        </w:tc>
+        <w:tc>
+          <w:tcPr>
+            <w:tcW w:type="dxa" w:w="6984"/>
+            <w:tcMar>
+              <w:top w:w="80" w:type="dxa"/>
+              <w:start w:w="120" w:type="dxa"/>
+              <w:bottom w:w="80" w:type="dxa"/>
+              <w:end w:w="120" w:type="dxa"/>
+            </w:tcMar>
+            <w:vAlign w:val="top"/>
+          </w:tcPr>
+          <w:p>
+            <w:r>
+              <w:t>Companies Act s47(2) and the private-company notification G.S.R. 464(E), 5 June 2015. Sections 43 and 47 do not apply to a private company where its memorandum or articles so provide. The complete constitutional documents are absent, so state the conditional analysis.</w:t>
+            </w:r>
+          </w:p>
+        </w:tc>
+      </w:tr>
+      <w:tr>
+        <w:tc>
+          <w:tcPr>
+            <w:tcW w:type="dxa" w:w="2376"/>
+            <w:tcMar>
+              <w:top w:w="80" w:type="dxa"/>
+              <w:start w:w="120" w:type="dxa"/>
+              <w:bottom w:w="80" w:type="dxa"/>
+              <w:end w:w="120" w:type="dxa"/>
+            </w:tcMar>
+            <w:vAlign w:val="top"/>
+          </w:tcPr>
+          <w:p>
+            <w:r>
+              <w:t>Issue below face value / standing</w:t>
+            </w:r>
+          </w:p>
+        </w:tc>
+        <w:tc>
+          <w:tcPr>
+            <w:tcW w:type="dxa" w:w="6984"/>
+            <w:tcMar>
+              <w:top w:w="80" w:type="dxa"/>
+              <w:start w:w="120" w:type="dxa"/>
+              <w:bottom w:w="80" w:type="dxa"/>
+              <w:end w:w="120" w:type="dxa"/>
+            </w:tcMar>
+            <w:vAlign w:val="top"/>
+          </w:tcPr>
+          <w:p>
+            <w:r>
+              <w:t>Companies Act ss53 and 244. Face value is not supplied, so no definitive s53 conclusion should be made. For s244, test both one-tenth of members and one-tenth of issued share capital with calls paid; the alternative member-count route matters.</w:t>
+            </w:r>
+          </w:p>
+        </w:tc>
+      </w:tr>
+      <w:tr>
+        <w:tc>
+          <w:tcPr>
+            <w:tcW w:type="dxa" w:w="2376"/>
+            <w:tcMar>
+              <w:top w:w="80" w:type="dxa"/>
+              <w:start w:w="120" w:type="dxa"/>
+              <w:bottom w:w="80" w:type="dxa"/>
+              <w:end w:w="120" w:type="dxa"/>
+            </w:tcMar>
+            <w:vAlign w:val="top"/>
+          </w:tcPr>
+          <w:p>
+            <w:r>
+              <w:t>Board notice</w:t>
+            </w:r>
+          </w:p>
+        </w:tc>
+        <w:tc>
+          <w:tcPr>
+            <w:tcW w:type="dxa" w:w="6984"/>
+            <w:tcMar>
+              <w:top w:w="80" w:type="dxa"/>
+              <w:start w:w="120" w:type="dxa"/>
+              <w:bottom w:w="80" w:type="dxa"/>
+              <w:end w:w="120" w:type="dxa"/>
+            </w:tcMar>
+            <w:vAlign w:val="top"/>
+          </w:tcPr>
+          <w:p>
+            <w:r>
+              <w:t>Companies Act s173(3) requires seven days notice but permits shorter notice for urgent business subject to the independent-director proviso. Keep this statutory rule distinct from the SHA 48-hour emergency mechanism and its financing restriction.</w:t>
+            </w:r>
+          </w:p>
+        </w:tc>
+      </w:tr>
     </w:tbl>
     <w:p>
       <w:pPr>
@@ -4846,6 +5736,30 @@
       </w:pPr>
       <w:r>
         <w:t>Primary-source links (verified 29 August 2026)</w:t>
+      </w:r>
+    </w:p>
+    <w:p>
+      <w:pPr>
+        <w:pStyle w:val="Heading2"/>
+      </w:pPr>
+      <w:r>
+        <w:t>Companies (Share Capital and Debentures) Rules 2014 (India Code): https://upload.indiacode.nic.in/showfile?actid=AC_CEN_2_11_00014_199215_1517807319932&amp;filename=1492085873402.pdf&amp;type=rule</w:t>
+      </w:r>
+    </w:p>
+    <w:p>
+      <w:pPr>
+        <w:pStyle w:val="Heading2"/>
+      </w:pPr>
+      <w:r>
+        <w:t>Companies (Prospectus and Allotment of Securities) Rules 2014, official updated rules (India Code): https://upload.indiacode.nic.in/showfile?actid=AC_CEN_22_29_00008_201318_1517807327856&amp;filename=Rule+Prospectus+Securities+07_08082018.pdf&amp;type=rule</w:t>
+      </w:r>
+    </w:p>
+    <w:p>
+      <w:pPr>
+        <w:pStyle w:val="Heading2"/>
+      </w:pPr>
+      <w:r>
+        <w:t>MCA private-company exemptions, G.S.R. 464(E) discussed in official MCA newsletter: https://www.mca.gov.in/Ministry/pdf/Monthly_Newsletter_May_2015.pdf</w:t>
       </w:r>
     </w:p>
     <w:p>
@@ -5001,7 +5915,7 @@
           <w:rFonts w:ascii="Calibri" w:hAnsi="Calibri"/>
           <w:sz w:val="22"/>
         </w:rPr>
-        <w:t>Vidya Drolia reference judgment, Supreme Court: https://api.sci.gov.in/supremecourt/2020/15088/15088_2020_33_1501_26735_Judgement_08-Mar-2021.pdf</w:t>
+        <w:t>Vidya Drolia v Durga Trading Corporation, Supreme Court judgment 14 Dec 2020: https://api.sci.gov.in/supremecourt/2018/26779/26779_2018_32_1501_25180_Judgement_14-Dec-2020.pdf</w:t>
       </w:r>
     </w:p>
     <w:p>
@@ -5650,7 +6564,7 @@
                 <w:b w:val="0"/>
                 <w:sz w:val="15"/>
               </w:rPr>
-              <w:t>Produce the core dates above; flag 22/25/26 Aug anomaly, 11/12 Sep mandate, 15 Sep approval vs 5 Oct creation, 30 Sep/30 Oct minutes and funding after allotment.</w:t>
+              <w:t>Produce the core dates above; flag 22/25/26 Aug anomaly, 11/12 Sep mandate, 15 Sep approval vs 5 Oct creation, 30 Sep meeting/15 Oct minutes and funding after allotment.</w:t>
             </w:r>
           </w:p>
         </w:tc>
@@ -5745,16 +6659,8 @@
             <w:vAlign w:val="top"/>
           </w:tcPr>
           <w:p>
-            <w:pPr>
-              <w:spacing w:after="40"/>
-            </w:pPr>
             <w:r>
-              <w:rPr>
-                <w:rFonts w:ascii="Calibri" w:hAnsi="Calibri"/>
-                <w:b w:val="0"/>
-                <w:sz w:val="15"/>
-              </w:rPr>
-              <w:t>Cover corporate approvals, purpose/duties, oppression, removal, arbitration split, employment, related-party/conflict, regulatory classification, evidence/authentication, privilege and remedies.</w:t>
+              <w:t>Cover corporate approvals, purpose/duties, oppression, removal, arbitration split, employment, related-party/conflict, regulatory classification, evidence/authentication, privilege and remedies. Include s42/private-placement records, s47 conditional voting rights, s53/face-value uncertainty, board short notice, pre-authority access disablement and Leena appointment.</w:t>
             </w:r>
           </w:p>
         </w:tc>
@@ -5797,16 +6703,8 @@
             <w:vAlign w:val="top"/>
           </w:tcPr>
           <w:p>
-            <w:pPr>
-              <w:spacing w:after="40"/>
-            </w:pPr>
             <w:r>
-              <w:rPr>
-                <w:rFonts w:ascii="Calibri" w:hAnsi="Calibri"/>
-                <w:b w:val="0"/>
-                <w:sz w:val="15"/>
-              </w:rPr>
-              <w:t>Reconcile 10m pre-bridge FD and 15m post-bridge FD; Aarav 27%; Meridian 40%; distinguish issued 14.5m and Aarav 27.93%. Identify 17.8% as unsupported.</w:t>
+              <w:t>Use INR 18.00 issue price; reconcile 10m pre-bridge FD and 15m post-bridge FD; Aarav 27%; Meridian 40%; distinguish issued 14.5m and Aarav 27.93%. Identify 17.8% as unsupported and explain why Meridian anti-dilution is not adjusted (specific waiver).</w:t>
             </w:r>
           </w:p>
         </w:tc>
@@ -5849,16 +6747,8 @@
             <w:vAlign w:val="top"/>
           </w:tcPr>
           <w:p>
-            <w:pPr>
-              <w:spacing w:after="40"/>
-            </w:pPr>
             <w:r>
-              <w:rPr>
-                <w:rFonts w:ascii="Calibri" w:hAnsi="Calibri"/>
-                <w:b w:val="0"/>
-                <w:sz w:val="15"/>
-              </w:rPr>
-              <w:t>Confirm genuine funding crisis; flag unsupported Nimbus recognition, cost totals, Vertex Labs 24.1/19.8/3.2/1.1 bridge, and Riverstone 0.9 shortfall.</w:t>
+              <w:t>Reconcile INR 13.4m cash at 9 Sep and distinguish payroll paid from other due/rolled outflows; test forecast assumptions; flag unsupported Nimbus recognition, cost classifications, Vertex Labs 24.1/19.8/3.2/1.1 bridge, and Riverstone 0.9 shortfall.</w:t>
             </w:r>
           </w:p>
         </w:tc>
@@ -6605,16 +7495,8 @@
             <w:vAlign w:val="top"/>
           </w:tcPr>
           <w:p>
-            <w:pPr>
-              <w:spacing w:after="40"/>
-            </w:pPr>
             <w:r>
-              <w:rPr>
-                <w:rFonts w:ascii="Calibri" w:hAnsi="Calibri"/>
-                <w:b w:val="0"/>
-                <w:sz w:val="15"/>
-              </w:rPr>
-              <w:t>Correct denominators/percentages and reconciliations; finds shortfalls without formula errors.</w:t>
+              <w:t>Uses INR 18.00; correct denominators/percentages and reconciliations; recognises specific anti-dilution waiver; reconciles cash evidence; finds shortfalls without formula errors.</w:t>
             </w:r>
           </w:p>
         </w:tc>
@@ -6900,7 +7782,7 @@
           <w:rFonts w:ascii="Calibri" w:hAnsi="Calibri"/>
           <w:sz w:val="22"/>
         </w:rPr>
-        <w:t>-5 each: asserts proven embezzlement; asserts Nimbus demanded removal; asserts completed bad-leaver transfer; or ignores genuine liquidity crisis.</w:t>
+        <w:t>-5 each: asserts proven embezzlement; asserts Nimbus demanded removal; asserts completed bad-leaver transfer; or ignores the documented liquidity evidence without engaging with material counter-evidence or forecast uncertainty.</w:t>
       </w:r>
     </w:p>
     <w:p>
@@ -7296,12 +8178,7 @@
     </w:p>
     <w:p>
       <w:r>
-        <w:rPr>
-          <w:rFonts w:ascii="Calibri" w:hAnsi="Calibri"/>
-          <w:i w:val="0"/>
-          <w:sz w:val="22"/>
-        </w:rPr>
-        <w:t>Recommended participant tasks: 60-minute chronology/issue spot; 90-minute contract and cap-table review; 3-hour NCLT merits/interim analysis; evidence admissibility and investigation plan; settlement memo; or cross-document contradiction audit. Do not distribute this guide or instructor ZIP. If a task excludes legal research, score only against authorities supplied or propositions framed conditionally.</w:t>
+        <w:t>Recommended participant tasks: chronology and issue spot; contract and cap-table review; NCLT merits/interim analysis; evidence admissibility and investigation plan; settlement memo; or cross-document contradiction audit. Set scope and expected output length in the task prompt; the benchmark does not prescribe a default time limit. Do not distribute this guide or instructor ZIP. If a task excludes legal research, score only against authorities supplied or propositions framed conditionally.</w:t>
       </w:r>
     </w:p>
     <w:sectPr>

</xml_diff>

<commit_message>
Benchmark quality and consistency update
</commit_message>
<xml_diff>
--- a/instructor/instructor_benchmark_guide.docx
+++ b/instructor/instructor_benchmark_guide.docx
@@ -271,7 +271,7 @@
         <w:pStyle w:val="ListBullet"/>
       </w:pPr>
       <w:r>
-        <w:t>Bridge ground truth: INR 90m for 5.0m shares means INR 18.00 per share. Meridian signed a specific 30 September waiver of any clause 7 adjustment for this bridge; the signatory-authority schedule is not in the participant file.</w:t>
+        <w:t>Bridge ground truth: INR 90m for 5.0m shares means INR 18.00 per share. Meridian signed a genuine, bridge-specific waiver of any clause 7 adjustment on 30 September. Its commercial logic is counter-intuitive in a control-shifting issue, the delegated-authority schedule is absent, and the EGM explanatory statement does not mention it. Strong models should query those matters; none alone proves invalidity.</w:t>
       </w:r>
     </w:p>
     <w:p>
@@ -284,7 +284,7 @@
           <w:rFonts w:ascii="Calibri" w:hAnsi="Calibri"/>
           <w:sz w:val="22"/>
         </w:rPr>
-        <w:t>The bridge had a real commercial rationale: the condensed bank statement reconciles to INR 13.4m unrestricted cash on 9 September after an INR 12.2m aggregate ordinary-operating debit. Payroll of INR 12.7m was paid on 30 September; a further INR 6.2m of statutory/other outflows remained due or rolled. A funding solution was required, although the size, price and allocation remain contestable.</w:t>
+        <w:t>The bridge had a real commercial rationale. VP-18 is a selected extract, not a complete statement. Its selected rows plus an INR 12.2m net as-of reconciliation adjustment produce the reported INR 13.4m unrestricted cash figure at 9 September, but do not disclose the timing or gross composition of omitted movements. VP-05 reports INR 38.6m unaudited cash on 7 August while the selected-row reconstruction shows INR 44.9m; the basis, cutoff and restriction classification are unresolved. Payroll of INR 12.7m was paid on 30 September and INR 6.2m of statutory/other outflows remained due or rolled. A funding solution was required, although the size, price and allocation remain contestable.</w:t>
       </w:r>
     </w:p>
     <w:p>
@@ -867,7 +867,7 @@
                 <w:b w:val="0"/>
                 <w:sz w:val="16"/>
               </w:rPr>
-              <w:t>Board flags cash, PA wording and Vertex Labs approval gaps.</w:t>
+              <w:t>Board flags cash, PA wording and Vertex Labs approval gaps. VP-05 records unaudited cash of INR 38.6m; VP-18's selected-row reconstruction shows INR 44.9m at 7 August. Basis and cutoff are unresolved.</w:t>
             </w:r>
           </w:p>
         </w:tc>
@@ -4359,7 +4359,7 @@
           </w:tcPr>
           <w:p>
             <w:r>
-              <w:t>28 Aug had six calendar days; 12 Sep had about 35h48m; 1 Oct had about 15h50m. SHA requires 48 hours only for an emergency meeting and bars financing-only use. Companies Act s173(3) instead permits shorter notice for urgent business subject to the independent-director safeguard; Rohan attended.</w:t>
+              <w:t>28 Aug had six calendar days; 12 Sep about 35h48m; 1 Oct about 15h50m. Section 173(3) requires seven days and permits shorter notice only for urgent business. The 12 Sep record states urgency; the 28 Aug and 1 Oct records do not. Rohan is a contractually appointed director, not shown to satisfy s149(6). The independent-director provisos therefore apply only if VertexPay had an independent director; if it did and none attended, decisions require circulation and ratification by at least one independent director, if any. Separately, SHA cl3.3 and Article 18.3 require seven days; the SHA emergency route requires 48 hours, an emergency statement and is unavailable solely for financing.</w:t>
             </w:r>
           </w:p>
         </w:tc>
@@ -4499,7 +4499,7 @@
           </w:tcPr>
           <w:p>
             <w:r>
-              <w:t>Meridian voted its CCPS on an as-converted basis. Section 47(2) is relevant, but private companies may disapply ss43/47 if their memorandum or articles so provide. Only extracts are supplied, so validity is deliberately unresolved.</w:t>
+              <w:t>Meridian voted its CCPS on an as-converted basis. Section 47(2) is relevant. Under G.S.R. 464(E), ss43 and 47 may be disapplied only where the memorandum or articles so provide; G.S.R. 583(E) further conditions the exemption on no default in filing financial statements under s137 or annual returns under s92. Complete constitutional documents and filing status are absent, so validity is deliberately unresolved.</w:t>
             </w:r>
           </w:p>
         </w:tc>
@@ -4639,7 +4639,7 @@
           </w:tcPr>
           <w:p>
             <w:r>
-              <w:t>Face value is omitted, weakening a definitive s53 discount analysis and capital-based s244 calculation. Aarav nevertheless appears to satisfy s244 through the alternative member-count limb (one of six members) and exceeds 10% on share-count/value assumptions used in the record.</w:t>
+              <w:t>Face value is omitted, weakening a definitive s53 discount analysis and capital-based s244 calculation. Aarav nevertheless appears to satisfy s244 through the alternative member-count limb (one of five post-bridge members) and exceeds 10% on share-count/value assumptions used in the record.</w:t>
             </w:r>
           </w:p>
         </w:tc>
@@ -4920,6 +4920,216 @@
           <w:p>
             <w:r>
               <w:t>The INR 9.6m figure spans 18 Jul, 22 Jul and 2 Aug. Treating it as purely August actual is a presentation/classification issue, not a new payment.</w:t>
+            </w:r>
+          </w:p>
+        </w:tc>
+      </w:tr>
+      <w:tr>
+        <w:tc>
+          <w:tcPr>
+            <w:tcW w:type="dxa" w:w="792"/>
+            <w:tcMar>
+              <w:top w:w="80" w:type="dxa"/>
+              <w:start w:w="120" w:type="dxa"/>
+              <w:bottom w:w="80" w:type="dxa"/>
+              <w:end w:w="120" w:type="dxa"/>
+            </w:tcMar>
+            <w:vAlign w:val="top"/>
+          </w:tcPr>
+          <w:p>
+            <w:r>
+              <w:t>I-36</w:t>
+            </w:r>
+          </w:p>
+        </w:tc>
+        <w:tc>
+          <w:tcPr>
+            <w:tcW w:type="dxa" w:w="1800"/>
+            <w:tcMar>
+              <w:top w:w="80" w:type="dxa"/>
+              <w:start w:w="120" w:type="dxa"/>
+              <w:bottom w:w="80" w:type="dxa"/>
+              <w:end w:w="120" w:type="dxa"/>
+            </w:tcMar>
+            <w:vAlign w:val="top"/>
+          </w:tcPr>
+          <w:p>
+            <w:r>
+              <w:t>Selected bank extract and cash discrepancy</w:t>
+            </w:r>
+          </w:p>
+        </w:tc>
+        <w:tc>
+          <w:tcPr>
+            <w:tcW w:type="dxa" w:w="2448"/>
+            <w:tcMar>
+              <w:top w:w="80" w:type="dxa"/>
+              <w:start w:w="120" w:type="dxa"/>
+              <w:bottom w:w="80" w:type="dxa"/>
+              <w:end w:w="120" w:type="dxa"/>
+            </w:tcMar>
+            <w:vAlign w:val="top"/>
+          </w:tcPr>
+          <w:p>
+            <w:r>
+              <w:t>VP-05 A; VP-10; VP-18</w:t>
+            </w:r>
+          </w:p>
+        </w:tc>
+        <w:tc>
+          <w:tcPr>
+            <w:tcW w:type="dxa" w:w="4320"/>
+            <w:tcMar>
+              <w:top w:w="80" w:type="dxa"/>
+              <w:start w:w="120" w:type="dxa"/>
+              <w:bottom w:w="80" w:type="dxa"/>
+              <w:end w:w="120" w:type="dxa"/>
+            </w:tcMar>
+            <w:vAlign w:val="top"/>
+          </w:tcPr>
+          <w:p>
+            <w:r>
+              <w:t>VP-18 is not a complete statement. Its INR 12.2m net as-of adjustment reconciles selected rows to the reported INR 13.4m at 9 Sep but proves neither timing nor gross omitted flows. VP-05's INR 38.6m cash at 7 Aug conflicts with the INR 44.9m selected-row reconstruction. Cutoff, restricted cash, omitted offsetting flows and reporting error remain competing explanations.</w:t>
+            </w:r>
+          </w:p>
+        </w:tc>
+      </w:tr>
+      <w:tr>
+        <w:tc>
+          <w:tcPr>
+            <w:tcW w:type="dxa" w:w="792"/>
+            <w:tcMar>
+              <w:top w:w="80" w:type="dxa"/>
+              <w:start w:w="120" w:type="dxa"/>
+              <w:bottom w:w="80" w:type="dxa"/>
+              <w:end w:w="120" w:type="dxa"/>
+            </w:tcMar>
+            <w:vAlign w:val="top"/>
+          </w:tcPr>
+          <w:p>
+            <w:r>
+              <w:t>I-37</w:t>
+            </w:r>
+          </w:p>
+        </w:tc>
+        <w:tc>
+          <w:tcPr>
+            <w:tcW w:type="dxa" w:w="1800"/>
+            <w:tcMar>
+              <w:top w:w="80" w:type="dxa"/>
+              <w:start w:w="120" w:type="dxa"/>
+              <w:bottom w:w="80" w:type="dxa"/>
+              <w:end w:w="120" w:type="dxa"/>
+            </w:tcMar>
+            <w:vAlign w:val="top"/>
+          </w:tcPr>
+          <w:p>
+            <w:r>
+              <w:t>Waiver commercial logic and disclosure</w:t>
+            </w:r>
+          </w:p>
+        </w:tc>
+        <w:tc>
+          <w:tcPr>
+            <w:tcW w:type="dxa" w:w="2448"/>
+            <w:tcMar>
+              <w:top w:w="80" w:type="dxa"/>
+              <w:start w:w="120" w:type="dxa"/>
+              <w:bottom w:w="80" w:type="dxa"/>
+              <w:end w:w="120" w:type="dxa"/>
+            </w:tcMar>
+            <w:vAlign w:val="top"/>
+          </w:tcPr>
+          <w:p>
+            <w:r>
+              <w:t>VP-05 D; VP-06; VP-17</w:t>
+            </w:r>
+          </w:p>
+        </w:tc>
+        <w:tc>
+          <w:tcPr>
+            <w:tcW w:type="dxa" w:w="4320"/>
+            <w:tcMar>
+              <w:top w:w="80" w:type="dxa"/>
+              <w:start w:w="120" w:type="dxa"/>
+              <w:bottom w:w="80" w:type="dxa"/>
+              <w:end w:w="120" w:type="dxa"/>
+            </w:tcMar>
+            <w:vAlign w:val="top"/>
+          </w:tcPr>
+          <w:p>
+            <w:r>
+              <w:t>Meridian's specific waiver is canonical and prevents a clause 7 adjustment in the corrected model. It is commercially counter-intuitive for a control-shifting bridge, its delegated-authority schedule is absent, and the EGM explanatory statement omits it. Give credit for querying authenticity, authority, motive and disclosure; do not treat suspicion alone as proof that the waiver is ineffective.</w:t>
+            </w:r>
+          </w:p>
+        </w:tc>
+      </w:tr>
+      <w:tr>
+        <w:tc>
+          <w:tcPr>
+            <w:tcW w:type="dxa" w:w="792"/>
+            <w:tcMar>
+              <w:top w:w="80" w:type="dxa"/>
+              <w:start w:w="120" w:type="dxa"/>
+              <w:bottom w:w="80" w:type="dxa"/>
+              <w:end w:w="120" w:type="dxa"/>
+            </w:tcMar>
+            <w:vAlign w:val="top"/>
+          </w:tcPr>
+          <w:p>
+            <w:r>
+              <w:t>I-38</w:t>
+            </w:r>
+          </w:p>
+        </w:tc>
+        <w:tc>
+          <w:tcPr>
+            <w:tcW w:type="dxa" w:w="1800"/>
+            <w:tcMar>
+              <w:top w:w="80" w:type="dxa"/>
+              <w:start w:w="120" w:type="dxa"/>
+              <w:bottom w:w="80" w:type="dxa"/>
+              <w:end w:w="120" w:type="dxa"/>
+            </w:tcMar>
+            <w:vAlign w:val="top"/>
+          </w:tcPr>
+          <w:p>
+            <w:r>
+              <w:t>Early price knowledge and Meridian naming coincidence</w:t>
+            </w:r>
+          </w:p>
+        </w:tc>
+        <w:tc>
+          <w:tcPr>
+            <w:tcW w:type="dxa" w:w="2448"/>
+            <w:tcMar>
+              <w:top w:w="80" w:type="dxa"/>
+              <w:start w:w="120" w:type="dxa"/>
+              <w:bottom w:w="80" w:type="dxa"/>
+              <w:end w:w="120" w:type="dxa"/>
+            </w:tcMar>
+            <w:vAlign w:val="top"/>
+          </w:tcPr>
+          <w:p>
+            <w:r>
+              <w:t>VP-01; VP-05; VP-16</w:t>
+            </w:r>
+          </w:p>
+        </w:tc>
+        <w:tc>
+          <w:tcPr>
+            <w:tcW w:type="dxa" w:w="4320"/>
+            <w:tcMar>
+              <w:top w:w="80" w:type="dxa"/>
+              <w:start w:w="120" w:type="dxa"/>
+              <w:bottom w:w="80" w:type="dxa"/>
+              <w:end w:w="120" w:type="dxa"/>
+            </w:tcMar>
+            <w:vAlign w:val="top"/>
+          </w:tcPr>
+          <w:p>
+            <w:r>
+              <w:t>Aarav objects to INR 18.00 in the 6 September WhatsApp exchange before the 10 September board pack and 12 September resolution first formally record that price. This supports questions about advance knowledge or an omitted communication, but does not prove a leak or fabrication. 'Meridian Chambers' is the registered-office building name; the record establishes no connection to Meridian Growth Fund I. Treat the shared word as a potential entity-resolution trap, not evidence of affiliation.</w:t>
             </w:r>
           </w:p>
         </w:tc>
@@ -5647,7 +5857,7 @@
           </w:tcPr>
           <w:p>
             <w:r>
-              <w:t>Companies Act s47(2) and the private-company notification G.S.R. 464(E), 5 June 2015. Sections 43 and 47 do not apply to a private company where its memorandum or articles so provide. The complete constitutional documents are absent, so state the conditional analysis.</w:t>
+              <w:t>Companies Act s47(2); G.S.R. 464(E), 5 June 2015; and amending G.S.R. 583(E), 13 June 2017. The ss43/47 exemption requires the memorandum or articles to provide for it and no default in financial-statement filing under s137 or annual-return filing under s92. Both the complete constitution and filing status are absent, so state both conditions.</w:t>
             </w:r>
           </w:p>
         </w:tc>
@@ -5719,7 +5929,7 @@
           </w:tcPr>
           <w:p>
             <w:r>
-              <w:t>Companies Act s173(3) requires seven days notice but permits shorter notice for urgent business subject to the independent-director proviso. Keep this statutory rule distinct from the SHA 48-hour emergency mechanism and its financing restriction.</w:t>
+              <w:t>Companies Act s173(3) requires seven days' notice and permits shorter notice only for urgent business. Apply the independent-director attendance/ratification provisos conditionally: Rohan is not shown to be a s149(6) independent director. Keep statutory validity distinct from the SHA/Articles seven-day rule and the SHA's 48-hour emergency mechanism, notice-content requirement and financing restriction.</w:t>
             </w:r>
           </w:p>
         </w:tc>
@@ -5735,7 +5945,7 @@
         <w:pStyle w:val="Heading2"/>
       </w:pPr>
       <w:r>
-        <w:t>Primary-source links (verified 29 August 2026)</w:t>
+        <w:t>Primary-source links checked 31 August 2026</w:t>
       </w:r>
     </w:p>
     <w:p>
@@ -5751,7 +5961,7 @@
         <w:pStyle w:val="Heading2"/>
       </w:pPr>
       <w:r>
-        <w:t>Companies (Prospectus and Allotment of Securities) Rules 2014, official updated rules (India Code): https://upload.indiacode.nic.in/showfile?actid=AC_CEN_22_29_00008_201318_1517807327856&amp;filename=Rule+Prospectus+Securities+07_08082018.pdf&amp;type=rule</w:t>
+        <w:t>Companies (Prospectus and Allotment of Securities) Rules 2014 and official amendment trail (India Code Act/rules page): https://www.indiacode.nic.in/handle/123456789/2114?locale=en</w:t>
       </w:r>
     </w:p>
     <w:p>
@@ -5759,7 +5969,15 @@
         <w:pStyle w:val="Heading2"/>
       </w:pPr>
       <w:r>
-        <w:t>MCA private-company exemptions, G.S.R. 464(E) discussed in official MCA newsletter: https://www.mca.gov.in/Ministry/pdf/Monthly_Newsletter_May_2015.pdf</w:t>
+        <w:t>MCA private-company exemption notifications: G.S.R. 464(E), 5 June 2015: https://www.mca.gov.in/Ministry/pdf/Exemptions_to_private_companies_05062015.pdf ; amended by G.S.R. 583(E), 13 June 2017: https://www.mca.gov.in/Ministry/pdf/ExemptionPrivateCompanies.pdf</w:t>
+      </w:r>
+    </w:p>
+    <w:p>
+      <w:pPr>
+        <w:pStyle w:val="Heading2"/>
+      </w:pPr>
+      <w:r>
+        <w:t>Current MCA PAS-3 instruction kit (ss39(4), 42(9), rr12 and 14): https://www.mca.gov.in/content/dam/mca-af-forms/instruction-kits/Instruction_Kit_PAS-3.pdf</w:t>
       </w:r>
     </w:p>
     <w:p>
@@ -6441,6 +6659,30 @@
     </w:p>
     <w:p>
       <w:pPr>
+        <w:pStyle w:val="ListBullet"/>
+      </w:pPr>
+      <w:r>
+        <w:t>Whether the INR 38.6m/INR 44.9m 7 August cash difference reflects cutoff, restriction classification, omitted offsetting movements or reporting error; no complete bank statement is supplied.</w:t>
+      </w:r>
+    </w:p>
+    <w:p>
+      <w:pPr>
+        <w:pStyle w:val="ListBullet"/>
+      </w:pPr>
+      <w:r>
+        <w:t>Whether Meridian's waiver was properly authorised and why it was commercially acceptable and omitted from the EGM explanatory statement; suspicion is appropriate, but invalidity is not established.</w:t>
+      </w:r>
+    </w:p>
+    <w:p>
+      <w:pPr>
+        <w:pStyle w:val="ListBullet"/>
+      </w:pPr>
+      <w:r>
+        <w:t>Whether Aarav's 6 September reference to INR 18.00 reflects advance knowledge or a missing communication; and whether the shared word 'Meridian' in the office-building and investor names is merely coincidental. The file does not resolve either point.</w:t>
+      </w:r>
+    </w:p>
+    <w:p>
+      <w:pPr>
         <w:pStyle w:val="Heading1"/>
       </w:pPr>
       <w:r>
@@ -6704,7 +6946,7 @@
           </w:tcPr>
           <w:p>
             <w:r>
-              <w:t>Use INR 18.00 issue price; reconcile 10m pre-bridge FD and 15m post-bridge FD; Aarav 27%; Meridian 40%; distinguish issued 14.5m and Aarav 27.93%. Identify 17.8% as unsupported and explain why Meridian anti-dilution is not adjusted (specific waiver).</w:t>
+              <w:t>Use INR 18.00 issue price; reconcile 10m pre-bridge FD and 15m post-bridge FD; Aarav 27%; Meridian 40%; distinguish issued 14.5m and Aarav 27.93%. Identify 17.8% as unsupported. Apply the specific waiver without an anti-dilution adjustment, while querying its authority, commercial logic and omission from the EGM explanatory statement.</w:t>
             </w:r>
           </w:p>
         </w:tc>
@@ -6748,7 +6990,7 @@
           </w:tcPr>
           <w:p>
             <w:r>
-              <w:t>Reconcile INR 13.4m cash at 9 Sep and distinguish payroll paid from other due/rolled outflows; test forecast assumptions; flag unsupported Nimbus recognition, cost classifications, Vertex Labs 24.1/19.8/3.2/1.1 bridge, and Riverstone 0.9 shortfall.</w:t>
+              <w:t>Reconcile the selected rows and net as-of adjustment to the reported INR 13.4m at 9 Sep without calling VP-18 complete; flag the INR 38.6m/INR 44.9m 7 Aug discrepancy and unknown gross omitted flows. Distinguish payroll paid from due/rolled outflows; test forecasts; flag Nimbus recognition, cost classifications, Vertex Labs 24.1/19.8/3.2/1.1 and the Riverstone 0.9 shortfall.</w:t>
             </w:r>
           </w:p>
         </w:tc>
@@ -7496,7 +7738,7 @@
           </w:tcPr>
           <w:p>
             <w:r>
-              <w:t>Uses INR 18.00; correct denominators/percentages and reconciliations; recognises specific anti-dilution waiver; reconciles cash evidence; finds shortfalls without formula errors.</w:t>
+              <w:t>Uses INR 18.00; correct denominators/percentages and reconciliations; applies but critically evaluates the specific waiver; treats VP-18 as incomplete; identifies the 7 Aug cash discrepancy, unknown omitted gross flows and payment shortfalls without formula errors.</w:t>
             </w:r>
           </w:p>
         </w:tc>
@@ -8203,14 +8445,27 @@
     <w:r>
       <w:rPr>
         <w:rFonts w:ascii="Calibri" w:hAnsi="Calibri"/>
-        <w:color w:val="595959"/>
         <w:sz w:val="16"/>
       </w:rPr>
       <w:t xml:space="preserve">VertexPay Indian Legal Case-Study Benchmark | </w:t>
     </w:r>
     <w:r>
       <w:fldChar w:fldCharType="begin"/>
-      <w:instrText xml:space="preserve">PAGE</w:instrText>
+    </w:r>
+    <w:r>
+      <w:instrText xml:space="preserve"> PAGE </w:instrText>
+    </w:r>
+    <w:r>
+      <w:fldChar w:fldCharType="separate"/>
+    </w:r>
+    <w:r>
+      <w:rPr>
+        <w:rFonts w:ascii="Calibri" w:hAnsi="Calibri"/>
+        <w:sz w:val="16"/>
+      </w:rPr>
+      <w:t>1</w:t>
+    </w:r>
+    <w:r>
       <w:fldChar w:fldCharType="end"/>
     </w:r>
   </w:p>

</xml_diff>